<commit_message>
versao para entrega da atividade
</commit_message>
<xml_diff>
--- a/PlanoDeAulaWord.docx
+++ b/PlanoDeAulaWord.docx
@@ -111,8 +111,8 @@
         <w:outlineLvl w:val="0"/>
         <w:rPr/>
       </w:pPr>
-      <w:bookmarkStart w:id="0" w:name="OrgXref.orge632cad"/>
-      <w:bookmarkStart w:id="1" w:name="orge632cad"/>
+      <w:bookmarkStart w:id="0" w:name="OrgXref.org49b2dfa"/>
+      <w:bookmarkStart w:id="1" w:name="org49b2dfa"/>
       <w:bookmarkEnd w:id="1"/>
       <w:r>
         <w:rPr/>
@@ -203,8 +203,8 @@
         <w:outlineLvl w:val="0"/>
         <w:rPr/>
       </w:pPr>
-      <w:bookmarkStart w:id="2" w:name="OrgXref.orgd019249"/>
-      <w:bookmarkStart w:id="3" w:name="orgd019249"/>
+      <w:bookmarkStart w:id="2" w:name="OrgXref.org3e22ace"/>
+      <w:bookmarkStart w:id="3" w:name="org3e22ace"/>
       <w:bookmarkEnd w:id="3"/>
       <w:r>
         <w:rPr/>
@@ -404,8 +404,8 @@
         <w:outlineLvl w:val="0"/>
         <w:rPr/>
       </w:pPr>
-      <w:bookmarkStart w:id="4" w:name="OrgXref.orgfe52ea2"/>
-      <w:bookmarkStart w:id="5" w:name="orgfe52ea2"/>
+      <w:bookmarkStart w:id="4" w:name="OrgXref.org84b7314"/>
+      <w:bookmarkStart w:id="5" w:name="org84b7314"/>
       <w:bookmarkEnd w:id="5"/>
       <w:r>
         <w:rPr/>
@@ -538,8 +538,8 @@
         <w:outlineLvl w:val="0"/>
         <w:rPr/>
       </w:pPr>
-      <w:bookmarkStart w:id="6" w:name="OrgXref.orgd86784a"/>
-      <w:bookmarkStart w:id="7" w:name="orgd86784a"/>
+      <w:bookmarkStart w:id="6" w:name="OrgXref.orgcffdd90"/>
+      <w:bookmarkStart w:id="7" w:name="orgcffdd90"/>
       <w:bookmarkEnd w:id="7"/>
       <w:r>
         <w:rPr/>
@@ -635,7 +635,7 @@
       </w:r>
       <w:r>
         <w:rPr/>
-        <w:t xml:space="preserve"> 2 aulas (100 minutos no total). </w:t>
+        <w:t xml:space="preserve"> 2 aulas </w:t>
       </w:r>
     </w:p>
     <w:p>
@@ -688,8 +688,8 @@
         <w:outlineLvl w:val="0"/>
         <w:rPr/>
       </w:pPr>
-      <w:bookmarkStart w:id="8" w:name="OrgXref.org3c30b97"/>
-      <w:bookmarkStart w:id="9" w:name="org3c30b97"/>
+      <w:bookmarkStart w:id="8" w:name="OrgXref.orgbc7ef23"/>
+      <w:bookmarkStart w:id="9" w:name="orgbc7ef23"/>
       <w:bookmarkEnd w:id="9"/>
       <w:r>
         <w:rPr/>
@@ -721,7 +721,7 @@
       </w:r>
       <w:r>
         <w:rPr/>
-        <w:t xml:space="preserve"> O docente projeta o simulador 3D com um alvo em posição fixa e desafia os alunos a atingirem o alvo na primeira tentativa real. </w:t>
+        <w:t xml:space="preserve"> O professor projeta o simulador 3D com um alvo em posição fixa e desafia os alunos a atingirem o alvo na primeira tentativa real. </w:t>
       </w:r>
     </w:p>
     <w:p>
@@ -1027,17 +1027,7 @@
       </w:r>
       <w:r>
         <w:rPr/>
-        <w:t xml:space="preserve"> Inserção dos parâmetros no simulador. Uso do </w:t>
-      </w:r>
-      <w:r>
-        <w:rPr>
-          <w:rStyle w:val="Bold"/>
-        </w:rPr>
-        <w:t>Scrubber</w:t>
-      </w:r>
-      <w:r>
-        <w:rPr/>
-        <w:t xml:space="preserve"> temporal para analisar se a velocidade vertical anula-se exatamente no ápice da trajetória. </w:t>
+        <w:t xml:space="preserve"> Inserção dos parâmetros no simulador. Uso do slide de tempo para analisar se a velocidade vertical anula-se exatamente no ápice da trajetória. </w:t>
       </w:r>
     </w:p>
     <w:p>
@@ -1075,8 +1065,8 @@
         <w:outlineLvl w:val="0"/>
         <w:rPr/>
       </w:pPr>
-      <w:bookmarkStart w:id="10" w:name="OrgXref.org6e0b0d2"/>
-      <w:bookmarkStart w:id="11" w:name="org6e0b0d2"/>
+      <w:bookmarkStart w:id="10" w:name="OrgXref.org321de70"/>
+      <w:bookmarkStart w:id="11" w:name="org321de70"/>
       <w:bookmarkEnd w:id="11"/>
       <w:r>
         <w:rPr/>
@@ -1254,8 +1244,8 @@
         <w:outlineLvl w:val="0"/>
         <w:rPr/>
       </w:pPr>
-      <w:bookmarkStart w:id="12" w:name="OrgXref.org8f43362"/>
-      <w:bookmarkStart w:id="13" w:name="org8f43362"/>
+      <w:bookmarkStart w:id="12" w:name="OrgXref.orgf37ea4b"/>
+      <w:bookmarkStart w:id="13" w:name="orgf37ea4b"/>
       <w:bookmarkEnd w:id="13"/>
       <w:r>
         <w:rPr/>
@@ -1284,8 +1274,8 @@
         <w:outlineLvl w:val="0"/>
         <w:rPr/>
       </w:pPr>
-      <w:bookmarkStart w:id="14" w:name="OrgXref.org4b6d5ba"/>
-      <w:bookmarkStart w:id="15" w:name="org4b6d5ba"/>
+      <w:bookmarkStart w:id="14" w:name="OrgXref.orgfaa213a"/>
+      <w:bookmarkStart w:id="15" w:name="orgfaa213a"/>
       <w:bookmarkEnd w:id="15"/>
       <w:r>
         <w:rPr/>
@@ -1400,7 +1390,6 @@
           <w:tab w:val="left" w:pos="720" w:leader="none"/>
         </w:tabs>
         <w:bidi w:val="0"/>
-        <w:spacing w:before="0" w:after="120"/>
         <w:ind w:hanging="360" w:start="720"/>
         <w:jc w:val="start"/>
         <w:rPr/>
@@ -1422,8 +1411,38 @@
         <w:t xml:space="preserve"> </w:t>
       </w:r>
     </w:p>
+    <w:p>
+      <w:pPr>
+        <w:pStyle w:val="BodyText"/>
+        <w:numPr>
+          <w:ilvl w:val="0"/>
+          <w:numId w:val="0"/>
+        </w:numPr>
+        <w:bidi w:val="0"/>
+        <w:spacing w:before="0" w:after="120"/>
+        <w:ind w:hanging="0" w:start="0"/>
+        <w:jc w:val="start"/>
+        <w:rPr/>
+      </w:pPr>
+      <w:r>
+        <w:rPr/>
+        <w:t xml:space="preserve">Obs. Não consegui fazer a animação funcionar no blender mas no navegador tá certinho e pode ser acessado no link </w:t>
+      </w:r>
+      <w:hyperlink r:id="rId11">
+        <w:r>
+          <w:rPr>
+            <w:rStyle w:val="Hyperlink"/>
+          </w:rPr>
+          <w:t>https://wagnermarques.github.io/curso_topicos_de_math_ensino_superior/</w:t>
+        </w:r>
+      </w:hyperlink>
+      <w:r>
+        <w:rPr/>
+        <w:t xml:space="preserve"> </w:t>
+      </w:r>
+    </w:p>
     <w:sectPr>
-      <w:footerReference w:type="default" r:id="rId11"/>
+      <w:footerReference w:type="default" r:id="rId12"/>
       <w:type w:val="nextPage"/>
       <w:pgSz w:w="11906" w:h="16838"/>
       <w:pgMar w:left="1134" w:right="1134" w:gutter="0" w:header="0" w:top="1134" w:footer="1134" w:bottom="1693"/>

</xml_diff>